<commit_message>
USA26038 report: fill PM closing block (Dacorey Slater contact)
Co-Authored-By: Claude Opus 4.8 <noreply@anthropic.com>
</commit_message>
<xml_diff>
--- a/02-facilities/HF-Sinclair/Artesia-NM/USA26038-job-report.docx
+++ b/02-facilities/HF-Sinclair/Artesia-NM/USA26038-job-report.docx
@@ -17579,7 +17579,7 @@
           <w:sz w:val="18"/>
           <w:szCs w:val="18"/>
         </w:rPr>
-        <w:t xml:space="preserve">Cell: [PM cell — to be added]</w:t>
+        <w:t xml:space="preserve">Cell: (832) 997-2072</w:t>
       </w:r>
     </w:p>
     <w:p>
@@ -17597,7 +17597,7 @@
           <w:sz w:val="18"/>
           <w:szCs w:val="18"/>
         </w:rPr>
-        <w:t xml:space="preserve">[PM email — to be added]</w:t>
+        <w:t xml:space="preserve">dslater@usadebusk.com</w:t>
       </w:r>
     </w:p>
     <w:sectPr>

</xml_diff>